<commit_message>
Update convert flow and benchmark export
</commit_message>
<xml_diff>
--- a/question_paper.docx
+++ b/question_paper.docx
@@ -52,7 +52,7 @@
         <w:t xml:space="preserve">Q1. </w:t>
       </w:r>
       <w:r>
-        <w:t xml:space="preserve">1</w:t>
+        <w:t xml:space="preserve">If y ∝ x and y=3x, then for x=5, y equals</w:t>
       </w:r>
     </w:p>
     <w:p>
@@ -143,7 +143,7 @@
         <w:t xml:space="preserve">Q2. </w:t>
       </w:r>
       <w:r>
-        <w:t xml:space="preserve">2</w:t>
+        <w:t xml:space="preserve">6 workers finish a job in 10 days. 12 workers will take</w:t>
       </w:r>
     </w:p>
     <w:p>
@@ -234,7 +234,7 @@
         <w:t xml:space="preserve">Q3. </w:t>
       </w:r>
       <w:r>
-        <w:t xml:space="preserve">3</w:t>
+        <w:t xml:space="preserve">If 5 kg costs ₹200, cost of 8 kg is</w:t>
       </w:r>
     </w:p>
     <w:p>
@@ -325,7 +325,7 @@
         <w:t xml:space="preserve">Q4. </w:t>
       </w:r>
       <w:r>
-        <w:t xml:space="preserve">4</w:t>
+        <w:t xml:space="preserve">For fixed distance, speed and time are</w:t>
       </w:r>
     </w:p>
     <w:p>
@@ -416,7 +416,7 @@
         <w:t xml:space="preserve">Q5. </w:t>
       </w:r>
       <w:r>
-        <w:t xml:space="preserve">5</w:t>
+        <w:t xml:space="preserve">3^2 × 3^(−5) equals</w:t>
       </w:r>
     </w:p>
     <w:p>
@@ -507,7 +507,7 @@
         <w:t xml:space="preserve">Q6. </w:t>
       </w:r>
       <w:r>
-        <w:t xml:space="preserve">6</w:t>
+        <w:t xml:space="preserve">0.00056 in standard form is</w:t>
       </w:r>
     </w:p>
     <w:p>
@@ -598,7 +598,7 @@
         <w:t xml:space="preserve">Q7. </w:t>
       </w:r>
       <w:r>
-        <w:t xml:space="preserve">7</w:t>
+        <w:t xml:space="preserve">10^(−3) equals</w:t>
       </w:r>
     </w:p>
     <w:p>
@@ -689,7 +689,7 @@
         <w:t xml:space="preserve">Q8. </w:t>
       </w:r>
       <w:r>
-        <w:t xml:space="preserve">8</w:t>
+        <w:t xml:space="preserve">a^(−2) equals</w:t>
       </w:r>
     </w:p>
     <w:p>
@@ -780,7 +780,7 @@
         <w:t xml:space="preserve">Q9. </w:t>
       </w:r>
       <w:r>
-        <w:t xml:space="preserve">9</w:t>
+        <w:t xml:space="preserve">Appropriate SI unit for volume is</w:t>
       </w:r>
     </w:p>
     <w:p>
@@ -871,7 +871,7 @@
         <w:t xml:space="preserve">Q10. </w:t>
       </w:r>
       <w:r>
-        <w:t xml:space="preserve">10</w:t>
+        <w:t xml:space="preserve">LSA of a cuboid with l=8 cm, b=5 cm, h=10 cm is</w:t>
       </w:r>
     </w:p>
     <w:p>
@@ -962,7 +962,7 @@
         <w:t xml:space="preserve">Q11. </w:t>
       </w:r>
       <w:r>
-        <w:t xml:space="preserve">11</w:t>
+        <w:t xml:space="preserve">Volume of a cuboid with l=5 cm, b=4 cm, h=3 cm is</w:t>
       </w:r>
     </w:p>
     <w:p>
@@ -1053,7 +1053,7 @@
         <w:t xml:space="preserve">Q12. </w:t>
       </w:r>
       <w:r>
-        <w:t xml:space="preserve">12</w:t>
+        <w:t xml:space="preserve">TSA of a cube of side 4 cm is</w:t>
       </w:r>
     </w:p>
     <w:p>
@@ -1144,7 +1144,7 @@
         <w:t xml:space="preserve">Q13. </w:t>
       </w:r>
       <w:r>
-        <w:t xml:space="preserve">13</w:t>
+        <w:t xml:space="preserve">If x=2, y=3, value of x^2 + 2xy is</w:t>
       </w:r>
     </w:p>
     <w:p>
@@ -1235,7 +1235,7 @@
         <w:t xml:space="preserve">Q14. </w:t>
       </w:r>
       <w:r>
-        <w:t xml:space="preserve">14</w:t>
+        <w:t xml:space="preserve">a^2 − b^2 factors as</w:t>
       </w:r>
     </w:p>
     <w:p>
@@ -1326,7 +1326,7 @@
         <w:t xml:space="preserve">Q15. </w:t>
       </w:r>
       <w:r>
-        <w:t xml:space="preserve">15</w:t>
+        <w:t xml:space="preserve">(x + 3)^2 equals</w:t>
       </w:r>
     </w:p>
     <w:p>
@@ -1417,7 +1417,7 @@
         <w:t xml:space="preserve">Q16. </w:t>
       </w:r>
       <w:r>
-        <w:t xml:space="preserve">16</w:t>
+        <w:t xml:space="preserve">(a + b)^2 equals</w:t>
       </w:r>
     </w:p>
     <w:p>
@@ -1508,7 +1508,7 @@
         <w:t xml:space="preserve">Q17. </w:t>
       </w:r>
       <w:r>
-        <w:t xml:space="preserve">17</w:t>
+        <w:t xml:space="preserve">On ₹1000 at 10% p.a. compounded annually for 2 years, amount is</w:t>
       </w:r>
     </w:p>
     <w:p>
@@ -1599,7 +1599,7 @@
         <w:t xml:space="preserve">Q18. </w:t>
       </w:r>
       <w:r>
-        <w:t xml:space="preserve">18</w:t>
+        <w:t xml:space="preserve">Value increases from 80 to 100. % increase is</w:t>
       </w:r>
     </w:p>
     <w:p>
@@ -1690,7 +1690,7 @@
         <w:t xml:space="preserve">Q19. </w:t>
       </w:r>
       <w:r>
-        <w:t xml:space="preserve">19</w:t>
+        <w:t xml:space="preserve">CP ₹400, SP ₹460. Profit % is</w:t>
       </w:r>
     </w:p>
     <w:p>
@@ -1781,7 +1781,7 @@
         <w:t xml:space="preserve">Q20. </w:t>
       </w:r>
       <w:r>
-        <w:t xml:space="preserve">20</w:t>
+        <w:t xml:space="preserve">Marked price ₹500, discount 10%. Selling price is</w:t>
       </w:r>
     </w:p>
     <w:p>
@@ -1872,7 +1872,7 @@
         <w:t xml:space="preserve">Q21. </w:t>
       </w:r>
       <w:r>
-        <w:t xml:space="preserve">21</w:t>
+        <w:t xml:space="preserve">5^3 equals</w:t>
       </w:r>
     </w:p>
     <w:p>
@@ -1963,7 +1963,7 @@
         <w:t xml:space="preserve">Q22. </w:t>
       </w:r>
       <w:r>
-        <w:t xml:space="preserve">22</w:t>
+        <w:t xml:space="preserve">Cube of (−3) equals</w:t>
       </w:r>
     </w:p>
     <w:p>
@@ -2054,7 +2054,7 @@
         <w:t xml:space="preserve">Q23. </w:t>
       </w:r>
       <w:r>
-        <w:t xml:space="preserve">23</w:t>
+        <w:t xml:space="preserve">∛27 equals</w:t>
       </w:r>
     </w:p>
     <w:p>
@@ -2145,7 +2145,7 @@
         <w:t xml:space="preserve">Q24. </w:t>
       </w:r>
       <w:r>
-        <w:t xml:space="preserve">24</w:t>
+        <w:t xml:space="preserve">Which is a perfect cube?</w:t>
       </w:r>
     </w:p>
     <w:p>
@@ -2236,7 +2236,7 @@
         <w:t xml:space="preserve">Q25. </w:t>
       </w:r>
       <w:r>
-        <w:t xml:space="preserve">25</w:t>
+        <w:t xml:space="preserve">13^2 equals</w:t>
       </w:r>
     </w:p>
     <w:p>
@@ -2327,7 +2327,7 @@
         <w:t xml:space="preserve">Q26. </w:t>
       </w:r>
       <w:r>
-        <w:t xml:space="preserve">26</w:t>
+        <w:t xml:space="preserve">Which could be a perfect square?</w:t>
       </w:r>
     </w:p>
     <w:p>
@@ -2418,7 +2418,7 @@
         <w:t xml:space="preserve">Q27. </w:t>
       </w:r>
       <w:r>
-        <w:t xml:space="preserve">27</w:t>
+        <w:t xml:space="preserve">√81 equals</w:t>
       </w:r>
     </w:p>
     <w:p>
@@ -2509,7 +2509,7 @@
         <w:t xml:space="preserve">Q28. </w:t>
       </w:r>
       <w:r>
-        <w:t xml:space="preserve">28</w:t>
+        <w:t xml:space="preserve">Which is a perfect square?</w:t>
       </w:r>
     </w:p>
     <w:p>
@@ -2600,7 +2600,7 @@
         <w:t xml:space="preserve">Q29. </w:t>
       </w:r>
       <w:r>
-        <w:t xml:space="preserve">29</w:t>
+        <w:t xml:space="preserve">A bag has 3 red, 2 blue, 5 green balls. Probability of red is</w:t>
       </w:r>
     </w:p>
     <w:p>
@@ -2691,7 +2691,7 @@
         <w:t xml:space="preserve">Q30. </w:t>
       </w:r>
       <w:r>
-        <w:t xml:space="preserve">30</w:t>
+        <w:t xml:space="preserve">Mode of 2, 3, 3, 4, 4, 4, 5 is</w:t>
       </w:r>
     </w:p>
     <w:p>
@@ -2782,7 +2782,7 @@
         <w:t xml:space="preserve">Q31. </w:t>
       </w:r>
       <w:r>
-        <w:t xml:space="preserve">31</w:t>
+        <w:t xml:space="preserve">Median of 3, 7, 2, 9, 5 is</w:t>
       </w:r>
     </w:p>
     <w:p>
@@ -2873,7 +2873,7 @@
         <w:t xml:space="preserve">Q32. </w:t>
       </w:r>
       <w:r>
-        <w:t xml:space="preserve">32</w:t>
+        <w:t xml:space="preserve">Mean of 8, 10, 10, 14 is</w:t>
       </w:r>
     </w:p>
     <w:p>
@@ -2964,7 +2964,7 @@
         <w:t xml:space="preserve">Q33. </w:t>
       </w:r>
       <w:r>
-        <w:t xml:space="preserve">33</w:t>
+        <w:t xml:space="preserve">Number of diagonals in any quadrilateral is</w:t>
       </w:r>
     </w:p>
     <w:p>
@@ -3055,7 +3055,7 @@
         <w:t xml:space="preserve">Q34. </w:t>
       </w:r>
       <w:r>
-        <w:t xml:space="preserve">34</w:t>
+        <w:t xml:space="preserve">In a parallelogram, adjacent angles are</w:t>
       </w:r>
     </w:p>
     <w:p>
@@ -3146,7 +3146,7 @@
         <w:t xml:space="preserve">Q35. </w:t>
       </w:r>
       <w:r>
-        <w:t xml:space="preserve">35</w:t>
+        <w:t xml:space="preserve">Each interior angle of a regular hexagon equals</w:t>
       </w:r>
     </w:p>
     <w:p>
@@ -3237,7 +3237,7 @@
         <w:t xml:space="preserve">Q36. </w:t>
       </w:r>
       <w:r>
-        <w:t xml:space="preserve">36</w:t>
+        <w:t xml:space="preserve">Sum of interior angles of any quadrilateral is</w:t>
       </w:r>
     </w:p>
     <w:p>
@@ -3328,7 +3328,7 @@
         <w:t xml:space="preserve">Q37. </w:t>
       </w:r>
       <w:r>
-        <w:t xml:space="preserve">37</w:t>
+        <w:t xml:space="preserve">x = 3 is a solution of 4x + 1 = 13 because</w:t>
       </w:r>
     </w:p>
     <w:p>
@@ -3419,7 +3419,7 @@
         <w:t xml:space="preserve">Q38. </w:t>
       </w:r>
       <w:r>
-        <w:t xml:space="preserve">38</w:t>
+        <w:t xml:space="preserve">Solve 7x − 3 = 4x + 12</w:t>
       </w:r>
     </w:p>
     <w:p>
@@ -3510,7 +3510,7 @@
         <w:t xml:space="preserve">Q39. </w:t>
       </w:r>
       <w:r>
-        <w:t xml:space="preserve">39</w:t>
+        <w:t xml:space="preserve">Solve 5(x − 2) = 20</w:t>
       </w:r>
     </w:p>
     <w:p>
@@ -3601,7 +3601,7 @@
         <w:t xml:space="preserve">Q40. </w:t>
       </w:r>
       <w:r>
-        <w:t xml:space="preserve">40</w:t>
+        <w:t xml:space="preserve">Solve 2x + 5 = 19</w:t>
       </w:r>
     </w:p>
     <w:p>
@@ -3692,7 +3692,7 @@
         <w:t xml:space="preserve">Q41. </w:t>
       </w:r>
       <w:r>
-        <w:t xml:space="preserve">41</w:t>
+        <w:t xml:space="preserve">Which is greater? −5/6 or −3/4</w:t>
       </w:r>
     </w:p>
     <w:p>
@@ -3783,7 +3783,7 @@
         <w:t xml:space="preserve">Q42. </w:t>
       </w:r>
       <w:r>
-        <w:t xml:space="preserve">42</w:t>
+        <w:t xml:space="preserve">Reciprocal of −3/5 is</w:t>
       </w:r>
     </w:p>
     <w:p>
@@ -3874,7 +3874,7 @@
         <w:t xml:space="preserve">Q43. </w:t>
       </w:r>
       <w:r>
-        <w:t xml:space="preserve">43</w:t>
+        <w:t xml:space="preserve">Standard form of −8/−12 is</w:t>
       </w:r>
     </w:p>
     <w:p>
@@ -3965,7 +3965,7 @@
         <w:t xml:space="preserve">Q44. </w:t>
       </w:r>
       <w:r>
-        <w:t xml:space="preserve">44</w:t>
+        <w:t xml:space="preserve">a/b + c/d = c/d + a/b illustrates the</w:t>
       </w:r>
     </w:p>
     <w:p>

</xml_diff>